<commit_message>
Articles of Association: align lettered lists with numbered clause text
Marianne's feedback (request 429f3e08): the lettered sub-items ("a.",
"b.", "c.", ...) sat too close to the margin, out of line with the
numbered clauses' text. Put them on the same two columns as numbered
clauses: marker flush at the margin, text at CLAUSE_INDENT — instead of
their own narrower marker/text positions.

Also fixes Remuneration Policy: the un-numbered lead-in paragraph right
after a top-level heading ("3 Remuneration of the members of the Board
of Directors" / "The remuneration offered to...") sat flush left,
un-indented, because the hang-indent tracking only carried forward from
a numbered sub-heading, not a heading itself. Flagged directly by
Marianne on p.2 and p.4 ("This needs to be moved in as well.").

Self-review passed (6/6 + the alignment assertion); moved to
pending_review.
</commit_message>
<xml_diff>
--- a/docs/files/Articles_of_Association__Policy_2026-05.docx
+++ b/docs/files/Articles_of_Association__Policy_2026-05.docx
@@ -19,7 +19,7 @@
               <a:graphicData uri="http://schemas.openxmlformats.org/drawingml/2006/picture">
                 <pic:pic>
                   <pic:nvPicPr>
-                    <pic:cNvPr id="0" name="tmp1bhyr3cr.png"/>
+                    <pic:cNvPr id="0" name="tmp_f0vwrsj.png"/>
                     <pic:cNvPicPr/>
                   </pic:nvPicPr>
                   <pic:blipFill>
@@ -1307,10 +1307,10 @@
     <w:p>
       <w:pPr>
         <w:tabs>
-          <w:tab w:pos="576" w:val="left"/>
+          <w:tab w:pos="708" w:val="left"/>
         </w:tabs>
         <w:spacing w:after="80"/>
-        <w:ind w:left="576" w:hanging="360"/>
+        <w:ind w:left="708" w:hanging="708"/>
       </w:pPr>
       <w:r>
         <w:rPr>
@@ -1328,10 +1328,10 @@
     <w:p>
       <w:pPr>
         <w:tabs>
-          <w:tab w:pos="576" w:val="left"/>
+          <w:tab w:pos="708" w:val="left"/>
         </w:tabs>
         <w:spacing w:after="80"/>
-        <w:ind w:left="576" w:hanging="360"/>
+        <w:ind w:left="708" w:hanging="708"/>
       </w:pPr>
       <w:r>
         <w:rPr>
@@ -1349,10 +1349,10 @@
     <w:p>
       <w:pPr>
         <w:tabs>
-          <w:tab w:pos="576" w:val="left"/>
+          <w:tab w:pos="708" w:val="left"/>
         </w:tabs>
         <w:spacing w:after="80"/>
-        <w:ind w:left="576" w:hanging="360"/>
+        <w:ind w:left="708" w:hanging="708"/>
       </w:pPr>
       <w:r>
         <w:rPr>
@@ -1370,10 +1370,10 @@
     <w:p>
       <w:pPr>
         <w:tabs>
-          <w:tab w:pos="576" w:val="left"/>
+          <w:tab w:pos="708" w:val="left"/>
         </w:tabs>
         <w:spacing w:after="80"/>
-        <w:ind w:left="576" w:hanging="360"/>
+        <w:ind w:left="708" w:hanging="708"/>
       </w:pPr>
       <w:r>
         <w:rPr>
@@ -1391,10 +1391,10 @@
     <w:p>
       <w:pPr>
         <w:tabs>
-          <w:tab w:pos="576" w:val="left"/>
+          <w:tab w:pos="708" w:val="left"/>
         </w:tabs>
         <w:spacing w:after="80"/>
-        <w:ind w:left="576" w:hanging="360"/>
+        <w:ind w:left="708" w:hanging="708"/>
       </w:pPr>
       <w:r>
         <w:rPr>
@@ -1496,10 +1496,10 @@
     <w:p>
       <w:pPr>
         <w:tabs>
-          <w:tab w:pos="576" w:val="left"/>
+          <w:tab w:pos="708" w:val="left"/>
         </w:tabs>
         <w:spacing w:after="80"/>
-        <w:ind w:left="576" w:hanging="360"/>
+        <w:ind w:left="708" w:hanging="708"/>
       </w:pPr>
       <w:r>
         <w:rPr>
@@ -1517,10 +1517,10 @@
     <w:p>
       <w:pPr>
         <w:tabs>
-          <w:tab w:pos="576" w:val="left"/>
+          <w:tab w:pos="708" w:val="left"/>
         </w:tabs>
         <w:spacing w:after="80"/>
-        <w:ind w:left="576" w:hanging="360"/>
+        <w:ind w:left="708" w:hanging="708"/>
       </w:pPr>
       <w:r>
         <w:rPr>
@@ -1538,10 +1538,10 @@
     <w:p>
       <w:pPr>
         <w:tabs>
-          <w:tab w:pos="576" w:val="left"/>
+          <w:tab w:pos="708" w:val="left"/>
         </w:tabs>
         <w:spacing w:after="80"/>
-        <w:ind w:left="576" w:hanging="360"/>
+        <w:ind w:left="708" w:hanging="708"/>
       </w:pPr>
       <w:r>
         <w:rPr>
@@ -1559,10 +1559,10 @@
     <w:p>
       <w:pPr>
         <w:tabs>
-          <w:tab w:pos="576" w:val="left"/>
+          <w:tab w:pos="708" w:val="left"/>
         </w:tabs>
         <w:spacing w:after="80"/>
-        <w:ind w:left="576" w:hanging="360"/>
+        <w:ind w:left="708" w:hanging="708"/>
       </w:pPr>
       <w:r>
         <w:rPr>
@@ -1580,10 +1580,10 @@
     <w:p>
       <w:pPr>
         <w:tabs>
-          <w:tab w:pos="576" w:val="left"/>
+          <w:tab w:pos="708" w:val="left"/>
         </w:tabs>
         <w:spacing w:after="80"/>
-        <w:ind w:left="576" w:hanging="360"/>
+        <w:ind w:left="708" w:hanging="708"/>
       </w:pPr>
       <w:r>
         <w:rPr>
@@ -1601,10 +1601,10 @@
     <w:p>
       <w:pPr>
         <w:tabs>
-          <w:tab w:pos="576" w:val="left"/>
+          <w:tab w:pos="708" w:val="left"/>
         </w:tabs>
         <w:spacing w:after="80"/>
-        <w:ind w:left="576" w:hanging="360"/>
+        <w:ind w:left="708" w:hanging="708"/>
       </w:pPr>
       <w:r>
         <w:rPr>
@@ -1622,10 +1622,10 @@
     <w:p>
       <w:pPr>
         <w:tabs>
-          <w:tab w:pos="576" w:val="left"/>
+          <w:tab w:pos="708" w:val="left"/>
         </w:tabs>
         <w:spacing w:after="80"/>
-        <w:ind w:left="576" w:hanging="360"/>
+        <w:ind w:left="708" w:hanging="708"/>
       </w:pPr>
       <w:r>
         <w:rPr>
@@ -1643,10 +1643,10 @@
     <w:p>
       <w:pPr>
         <w:tabs>
-          <w:tab w:pos="576" w:val="left"/>
+          <w:tab w:pos="708" w:val="left"/>
         </w:tabs>
         <w:spacing w:after="80"/>
-        <w:ind w:left="576" w:hanging="360"/>
+        <w:ind w:left="708" w:hanging="708"/>
       </w:pPr>
       <w:r>
         <w:rPr>
@@ -1664,10 +1664,10 @@
     <w:p>
       <w:pPr>
         <w:tabs>
-          <w:tab w:pos="576" w:val="left"/>
+          <w:tab w:pos="708" w:val="left"/>
         </w:tabs>
         <w:spacing w:after="80"/>
-        <w:ind w:left="576" w:hanging="360"/>
+        <w:ind w:left="708" w:hanging="708"/>
       </w:pPr>
       <w:r>
         <w:rPr>
@@ -1685,10 +1685,10 @@
     <w:p>
       <w:pPr>
         <w:tabs>
-          <w:tab w:pos="576" w:val="left"/>
+          <w:tab w:pos="708" w:val="left"/>
         </w:tabs>
         <w:spacing w:after="80"/>
-        <w:ind w:left="576" w:hanging="360"/>
+        <w:ind w:left="708" w:hanging="708"/>
       </w:pPr>
       <w:r>
         <w:rPr>
@@ -1706,10 +1706,10 @@
     <w:p>
       <w:pPr>
         <w:tabs>
-          <w:tab w:pos="576" w:val="left"/>
+          <w:tab w:pos="708" w:val="left"/>
         </w:tabs>
         <w:spacing w:after="80"/>
-        <w:ind w:left="576" w:hanging="360"/>
+        <w:ind w:left="708" w:hanging="708"/>
       </w:pPr>
       <w:r>
         <w:rPr>

</xml_diff>